<commit_message>
Fix figures and descriptions that did not match the data
- Hospital ER README: hourly wait range is 33.9-37.2 min and hourly
  arrivals range 349-436 (recomputed from the model in HospitalER.pbix)
- Hospital ER report (.docx): correct the hourly wait range, and replace
  the "00:00-02:00 busiest block" claim, which came from a three-hour
  bin, with the busiest single hour (11 PM)
- Coffee README: source is an Excel workbook, not a CSV file
- Main README: RFM has SQL scripts, not a .pbix file

Co-Authored-By: Claude Opus 5.5 <noreply@anthropic.com>
Claude-Session: https://claude.ai/code/session_01PPgREeYCL1L2g1BpwATAC1
</commit_message>
<xml_diff>
--- a/hospital-er/Hospital_ER_Key_Takeaways_Report.docx
+++ b/hospital-er/Hospital_ER_Key_Takeaways_Report.docx
@@ -328,7 +328,7 @@
         <w:spacing w:after="80"/>
       </w:pPr>
       <w:r>
-        <w:t>Hourly demand is also fairly even across the day; the 00:00–02:00 block is the single busiest 2-hour window (1,154 visits), suggesting overnight/early-morning demand is not lighter than daytime.</w:t>
+        <w:t>Hourly demand is also fairly even across the day: every hour receives between 349 and 436 visits, and the busiest single hour is 11 PM (436 visits), so overnight demand is not lighter than daytime.</w:t>
       </w:r>
     </w:p>
     <w:p>
@@ -376,7 +376,7 @@
         <w:spacing w:after="80"/>
       </w:pPr>
       <w:r>
-        <w:t>Wait times are consistent across all hours of the day (33.5–36.3 minutes) — long waits are not concentrated in any particular shift or overnight period.</w:t>
+        <w:t>Wait times are consistent across all hours of the day (33.9–37.2 minutes) — long waits are not concentrated in any particular shift or overnight period.</w:t>
       </w:r>
     </w:p>
     <w:p>

</xml_diff>